<commit_message>
Corrected version of sheet 6
</commit_message>
<xml_diff>
--- a/ML Safety Exercise Sheet 6.docx
+++ b/ML Safety Exercise Sheet 6.docx
@@ -204,10 +204,7 @@
         <w:t xml:space="preserve"> It is hard to verify that </w:t>
       </w:r>
       <w:r>
-        <w:t>because</w:t>
-      </w:r>
-      <w:r>
-        <w:t xml:space="preserve"> we cannot directly observe the model's internal reasoning. We only see the input, output, and generated explanation, so it is difficult to know whether the explanation matches the true reasoning process.</w:t>
+        <w:t>because we cannot directly observe the model's internal reasoning. We only see the input, output, and generated explanation, so it is difficult to know whether the explanation matches the true reasoning process.</w:t>
       </w:r>
     </w:p>
     <w:p>
@@ -215,10 +212,7 @@
         <w:t>2.</w:t>
       </w:r>
       <w:r>
-        <w:t xml:space="preserve"> </w:t>
-      </w:r>
-      <w:r>
-        <w:t>What is simulatability as a measure of thinking-trace quality? Give an example scenario where simulatability is satisfied but the trace is still unfaithful.</w:t>
+        <w:t xml:space="preserve"> What is simulatability as a measure of thinking-trace quality? Give an example scenario where simulatability is satisfied but the trace is still unfaithful.</w:t>
       </w:r>
     </w:p>
     <w:p/>
@@ -267,10 +261,7 @@
         <w:t>3.</w:t>
       </w:r>
       <w:r>
-        <w:t xml:space="preserve"> </w:t>
-      </w:r>
-      <w:r>
-        <w:t>What does counterfactual simulatability add? Why is it a stricter test?</w:t>
+        <w:t xml:space="preserve"> What does counterfactual simulatability add? Why is it a stricter test?</w:t>
       </w:r>
     </w:p>
     <w:p>
@@ -360,10 +351,7 @@
         <w:t>2.</w:t>
       </w:r>
       <w:r>
-        <w:t xml:space="preserve"> </w:t>
-      </w:r>
-      <w:r>
-        <w:t>Select five correctly classified images- at least one per model. Visualize the explanation (heatmap or sensitivity map) overlaid on the original image.</w:t>
+        <w:t xml:space="preserve"> Select five correctly classified images- at least one per model. Visualize the explanation (heatmap or sensitivity map) overlaid on the original image.</w:t>
       </w:r>
     </w:p>
     <w:p>
@@ -482,6 +470,9 @@
     <w:p/>
     <w:p>
       <w:r>
+        <w:rPr>
+          <w:noProof/>
+        </w:rPr>
         <w:drawing>
           <wp:inline distT="0" distB="0" distL="0" distR="0" wp14:anchorId="4674F587" wp14:editId="79B0E998">
             <wp:extent cx="5731510" cy="2748915"/>
@@ -623,6 +614,7 @@
         <w:rPr>
           <w:b/>
           <w:bCs/>
+          <w:noProof/>
         </w:rPr>
         <w:drawing>
           <wp:inline distT="0" distB="0" distL="0" distR="0" wp14:anchorId="18842D5C" wp14:editId="1636C73E">
@@ -692,6 +684,7 @@
         <w:rPr>
           <w:b/>
           <w:bCs/>
+          <w:noProof/>
         </w:rPr>
         <w:drawing>
           <wp:inline distT="0" distB="0" distL="0" distR="0" wp14:anchorId="776AC7DC" wp14:editId="4C6F94D1">
@@ -771,6 +764,7 @@
         <w:rPr>
           <w:b/>
           <w:bCs/>
+          <w:noProof/>
         </w:rPr>
         <w:drawing>
           <wp:inline distT="0" distB="0" distL="0" distR="0" wp14:anchorId="7E17E851" wp14:editId="4D4463B9">
@@ -847,6 +841,9 @@
     <w:p/>
     <w:p>
       <w:r>
+        <w:rPr>
+          <w:noProof/>
+        </w:rPr>
         <w:drawing>
           <wp:inline distT="0" distB="0" distL="0" distR="0" wp14:anchorId="6CD97F32" wp14:editId="637C25CA">
             <wp:extent cx="5417820" cy="2255520"/>
@@ -902,39 +899,14 @@
           <w:b/>
           <w:bCs/>
         </w:rPr>
-        <w:t xml:space="preserve">Misclassified Image </w:t>
-      </w:r>
-      <w:r>
-        <w:rPr>
-          <w:b/>
-          <w:bCs/>
-        </w:rPr>
-        <w:t>2</w:t>
-      </w:r>
-      <w:r>
-        <w:rPr>
-          <w:b/>
-          <w:bCs/>
-        </w:rPr>
-        <w:t xml:space="preserve">- </w:t>
-      </w:r>
-      <w:r>
-        <w:rPr>
-          <w:b/>
-          <w:bCs/>
-        </w:rPr>
-        <w:t>Vehicle</w:t>
-      </w:r>
-      <w:r>
-        <w:rPr>
-          <w:b/>
-          <w:bCs/>
-        </w:rPr>
-        <w:t xml:space="preserve"> Model</w:t>
-      </w:r>
-    </w:p>
-    <w:p>
-      <w:r>
+        <w:t>Misclassified Image 2- Vehicle Model</w:t>
+      </w:r>
+    </w:p>
+    <w:p>
+      <w:r>
+        <w:rPr>
+          <w:noProof/>
+        </w:rPr>
         <w:drawing>
           <wp:inline distT="0" distB="0" distL="0" distR="0" wp14:anchorId="169C66AF" wp14:editId="1D75F1B9">
             <wp:extent cx="5731510" cy="3021965"/>
@@ -1072,6 +1044,9 @@
     </w:p>
     <w:p>
       <w:r>
+        <w:rPr>
+          <w:noProof/>
+        </w:rPr>
         <w:drawing>
           <wp:inline distT="0" distB="0" distL="0" distR="0" wp14:anchorId="73868F9F" wp14:editId="552309AE">
             <wp:extent cx="5731510" cy="3027680"/>
@@ -1125,15 +1100,13 @@
         <w:t xml:space="preserve">1. </w:t>
       </w:r>
       <w:r>
-        <w:t xml:space="preserve">Suppose your explanation method reveals that your model predicts “pedestrian present” based primarily on a region of the sky rather than the pedestrian itself. What would this imply about the model’s generalization? What could cause this </w:t>
-      </w:r>
-      <w:proofErr w:type="spellStart"/>
-      <w:r>
-        <w:t>behavior</w:t>
-      </w:r>
-      <w:proofErr w:type="spellEnd"/>
-      <w:r>
-        <w:t>?</w:t>
+        <w:t>Suppose your explanation method reveals that your model predicts “pedestrian present” based primarily on a region of the sky rather than the pedestrian itself. What would this imply about the model’s generalization? What could cause this behavio</w:t>
+      </w:r>
+      <w:r>
+        <w:t>u</w:t>
+      </w:r>
+      <w:r>
+        <w:t>r?</w:t>
       </w:r>
     </w:p>
     <w:p>
@@ -1169,10 +1142,7 @@
         <w:t>2.</w:t>
       </w:r>
       <w:r>
-        <w:t xml:space="preserve"> </w:t>
-      </w:r>
-      <w:r>
-        <w:t>Now test your models on images from different conditions than the ones they were trained on- for example a different town layout, nighttime, or foggy weather. Apply the same explanation method as before.</w:t>
+        <w:t xml:space="preserve"> Now test your models on images from different conditions than the ones they were trained on- for example a different town layout, nighttime, or foggy weather. Apply the same explanation method as before.</w:t>
       </w:r>
     </w:p>
     <w:p>
@@ -1255,6 +1225,9 @@
     </w:p>
     <w:p>
       <w:r>
+        <w:rPr>
+          <w:noProof/>
+        </w:rPr>
         <w:drawing>
           <wp:inline distT="0" distB="0" distL="0" distR="0" wp14:anchorId="5C47D259" wp14:editId="2085E14C">
             <wp:extent cx="5731510" cy="2774950"/>
@@ -1297,83 +1270,121 @@
         <w:t>For the vehicle model, the highlighted region still corresponds to the relevant object. Despite the reduced visibility caused by fog, the saliency map focuses primarily on the vehicle region on the left side of the image. The model does not appear to rely heavily on unrelated background features such as buildings or the sky. Therefore, the explanation remains consistent with the prediction and indicates that the model is still identifying vehicle-related features under foggy conditions.</w:t>
       </w:r>
     </w:p>
+    <w:p>
+      <w:r>
+        <w:drawing>
+          <wp:inline distT="0" distB="0" distL="0" distR="0" wp14:anchorId="075FECFB" wp14:editId="3FC20562">
+            <wp:extent cx="5731510" cy="2724150"/>
+            <wp:effectExtent l="0" t="0" r="2540" b="0"/>
+            <wp:docPr id="1304527494" name="Picture 1"/>
+            <wp:cNvGraphicFramePr>
+              <a:graphicFrameLocks xmlns:a="http://schemas.openxmlformats.org/drawingml/2006/main" noChangeAspect="1"/>
+            </wp:cNvGraphicFramePr>
+            <a:graphic xmlns:a="http://schemas.openxmlformats.org/drawingml/2006/main">
+              <a:graphicData uri="http://schemas.openxmlformats.org/drawingml/2006/picture">
+                <pic:pic xmlns:pic="http://schemas.openxmlformats.org/drawingml/2006/picture">
+                  <pic:nvPicPr>
+                    <pic:cNvPr id="1304527494" name=""/>
+                    <pic:cNvPicPr/>
+                  </pic:nvPicPr>
+                  <pic:blipFill>
+                    <a:blip r:embed="rId14"/>
+                    <a:stretch>
+                      <a:fillRect/>
+                    </a:stretch>
+                  </pic:blipFill>
+                  <pic:spPr>
+                    <a:xfrm>
+                      <a:off x="0" y="0"/>
+                      <a:ext cx="5731510" cy="2724150"/>
+                    </a:xfrm>
+                    <a:prstGeom prst="rect">
+                      <a:avLst/>
+                    </a:prstGeom>
+                  </pic:spPr>
+                </pic:pic>
+              </a:graphicData>
+            </a:graphic>
+          </wp:inline>
+        </w:drawing>
+      </w:r>
+    </w:p>
+    <w:p>
+      <w:r>
+        <w:t>Traffic light Model</w:t>
+      </w:r>
+    </w:p>
+    <w:p>
+      <w:r>
+        <w:t xml:space="preserve">For the traffic-light model, the highlighted region still corresponds to the relevant object. Despite the reduced visibility caused by fog, the saliency map remains concentrated around the traffic-light region. The explanation is more focused than some of the normal-weather examples and indicates that the model continues to rely on traffic-light-related features when making its prediction. Therefore, the highlighted </w:t>
+      </w:r>
+      <w:r>
+        <w:lastRenderedPageBreak/>
+        <w:t>regions remain consistent with the target object even under different environmental conditions.</w:t>
+      </w:r>
+    </w:p>
     <w:p/>
     <w:p>
       <w:r>
-        <w:t>Traffic light Model</w:t>
-      </w:r>
-    </w:p>
-    <w:p>
-      <w:r>
-        <w:t>For the traffic-light model, the highlighted region still corresponds to the relevant object. Despite the reduced visibility caused by fog, the saliency map remains concentrated around the traffic-light region. The explanation is more focused than some of the normal-weather examples and indicates that the model continues to rely on traffic-light-related features when making its prediction. Therefore, the highlighted regions remain consistent with the target object even under different environmental conditions.</w:t>
+        <w:t>b)</w:t>
+      </w:r>
+      <w:r>
+        <w:t xml:space="preserve"> </w:t>
+      </w:r>
+      <w:r>
+        <w:t xml:space="preserve">Do you observe evidence that the model relied on background or spurious features (lighting, road texture, sky </w:t>
+      </w:r>
+      <w:proofErr w:type="spellStart"/>
+      <w:r>
+        <w:t>color</w:t>
+      </w:r>
+      <w:proofErr w:type="spellEnd"/>
+      <w:r>
+        <w:t>) that are specific to the original training conditions?</w:t>
+      </w:r>
+    </w:p>
+    <w:p>
+      <w:r>
+        <w:t xml:space="preserve">Ans </w:t>
+      </w:r>
+    </w:p>
+    <w:p>
+      <w:r>
+        <w:t xml:space="preserve">When comparing the saliency maps from the original test set and the foggy test set, there is limited evidence that the models rely heavily on spurious background features such as sky </w:t>
+      </w:r>
+      <w:r>
+        <w:t>colour</w:t>
+      </w:r>
+      <w:r>
+        <w:t xml:space="preserve">, lighting conditions, or road texture. In the normal-weather images, the pedestrian and vehicle models primarily focused on the relevant objects, and this </w:t>
+      </w:r>
+      <w:r>
+        <w:t>behaviour</w:t>
+      </w:r>
+      <w:r>
+        <w:t xml:space="preserve"> remained largely unchanged in the foggy environment. Similarly, the traffic-light model continued to focus on the traffic-light region despite reduced visibility.</w:t>
+      </w:r>
+    </w:p>
+    <w:p>
+      <w:r>
+        <w:t xml:space="preserve">If the models had relied strongly on background features from the original training conditions, we would expect the saliency maps to shift toward fog, lighting effects, road texture, or other environmental features when tested on the fog dataset. However, the explanations remained </w:t>
+      </w:r>
+      <w:r>
+        <w:t>centred</w:t>
+      </w:r>
+      <w:r>
+        <w:t xml:space="preserve"> on the target objects in most cases. Therefore, the results suggest that the models learned meaningful object-related features rather than depending primarily on condition-specific background cues.</w:t>
       </w:r>
     </w:p>
     <w:p/>
     <w:p>
       <w:r>
-        <w:t>b)</w:t>
+        <w:t>c)</w:t>
       </w:r>
       <w:r>
         <w:t xml:space="preserve"> </w:t>
       </w:r>
       <w:r>
-        <w:t xml:space="preserve">Do you observe evidence that the model relied on background or spurious features (lighting, road texture, sky </w:t>
-      </w:r>
-      <w:proofErr w:type="spellStart"/>
-      <w:r>
-        <w:t>color</w:t>
-      </w:r>
-      <w:proofErr w:type="spellEnd"/>
-      <w:r>
-        <w:t>) that are specific to the original training conditions?</w:t>
-      </w:r>
-    </w:p>
-    <w:p>
-      <w:r>
-        <w:t xml:space="preserve">Ans </w:t>
-      </w:r>
-    </w:p>
-    <w:p>
-      <w:r>
-        <w:t xml:space="preserve">When comparing the saliency maps from the original test set and the foggy test set, there is limited evidence that the models rely heavily on spurious background features such as sky </w:t>
-      </w:r>
-      <w:r>
-        <w:t>colour</w:t>
-      </w:r>
-      <w:r>
-        <w:t xml:space="preserve">, lighting conditions, or road texture. In the normal-weather images, </w:t>
-      </w:r>
-      <w:r>
-        <w:lastRenderedPageBreak/>
-        <w:t xml:space="preserve">the pedestrian and vehicle models primarily focused on the relevant objects, and this </w:t>
-      </w:r>
-      <w:r>
-        <w:t>behaviour</w:t>
-      </w:r>
-      <w:r>
-        <w:t xml:space="preserve"> remained largely unchanged in the foggy environment. Similarly, the traffic-light model continued to focus on the traffic-light region despite reduced visibility.</w:t>
-      </w:r>
-    </w:p>
-    <w:p>
-      <w:r>
-        <w:t xml:space="preserve">If the models had relied strongly on background features from the original training conditions, we would expect the saliency maps to shift toward fog, lighting effects, road texture, or other environmental features when tested on the fog dataset. However, the explanations remained </w:t>
-      </w:r>
-      <w:r>
-        <w:t>centred</w:t>
-      </w:r>
-      <w:r>
-        <w:t xml:space="preserve"> on the target objects in most cases. Therefore, the results suggest that the models learned meaningful object-related features rather than depending primarily on condition-specific background cues.</w:t>
-      </w:r>
-    </w:p>
-    <w:p/>
-    <w:p>
-      <w:r>
-        <w:t>c)</w:t>
-      </w:r>
-      <w:r>
-        <w:t xml:space="preserve"> </w:t>
-      </w:r>
-      <w:r>
         <w:t>How do the model’s accuracy and explanation quality change across conditions?</w:t>
       </w:r>
     </w:p>
@@ -1396,14 +1407,6 @@
       <w:r>
         <w:t>Overall, the explanations remained largely consistent across conditions, as the models continued to focus on the target objects. However, the vehicle model showed that explanation quality alone does not guarantee strong predictive performance, since the model could still attend to relevant regions while making less accurate predictions under challenging environmental conditions.</w:t>
       </w:r>
-    </w:p>
-    <w:p/>
-    <w:p>
-      <w:pPr>
-        <w:rPr>
-          <w:lang w:val="en-US"/>
-        </w:rPr>
-      </w:pPr>
     </w:p>
     <w:sectPr>
       <w:pgSz w:w="11906" w:h="16838"/>
@@ -2018,6 +2021,7 @@
   <w:style w:type="character" w:default="1" w:styleId="DefaultParagraphFont">
     <w:name w:val="Default Paragraph Font"/>
     <w:uiPriority w:val="1"/>
+    <w:semiHidden/>
     <w:unhideWhenUsed/>
   </w:style>
   <w:style w:type="table" w:default="1" w:styleId="TableNormal">

</xml_diff>